<commit_message>
Report: added database verification section with phpMyAdmin screenshot and connection details.
</commit_message>
<xml_diff>
--- a/CPCS405_Project_Report.docx
+++ b/CPCS405_Project_Report.docx
@@ -2213,7 +2213,110 @@
         <w:rPr>
           <w:color w:val="2E74B5"/>
         </w:rPr>
-        <w:t>6.3  Key Database Operations</w:t>
+        <w:t>6.3  Database Verification (phpMyAdmin)</w:t>
+      </w:r>
+    </w:p>
+    <w:p>
+      <w:pPr/>
+      <w:r>
+        <w:rPr>
+          <w:sz w:val="22"/>
+        </w:rPr>
+        <w:t>The following screenshot shows the ExamResults table as seen in phpMyAdmin (XAMPP at http://localhost/phpmyadmin). It confirms that student results are successfully stored after exam completion, with all required columns correctly populated: ID, Student ID, Course Name, Year, Semester, and Score.</w:t>
+      </w:r>
+    </w:p>
+    <w:p>
+      <w:pPr>
+        <w:jc w:val="center"/>
+      </w:pPr>
+      <w:r>
+        <w:drawing>
+          <wp:inline xmlns:a="http://schemas.openxmlformats.org/drawingml/2006/main" xmlns:pic="http://schemas.openxmlformats.org/drawingml/2006/picture">
+            <wp:extent cx="5303520" cy="5303520"/>
+            <wp:docPr id="9" name="Picture 9"/>
+            <wp:cNvGraphicFramePr>
+              <a:graphicFrameLocks noChangeAspect="1"/>
+            </wp:cNvGraphicFramePr>
+            <a:graphic>
+              <a:graphicData uri="http://schemas.openxmlformats.org/drawingml/2006/picture">
+                <pic:pic>
+                  <pic:nvPicPr>
+                    <pic:cNvPr id="0" name="phpmyadmin_examresults_1778859851919.png"/>
+                    <pic:cNvPicPr/>
+                  </pic:nvPicPr>
+                  <pic:blipFill>
+                    <a:blip r:embed="rId16"/>
+                    <a:stretch>
+                      <a:fillRect/>
+                    </a:stretch>
+                  </pic:blipFill>
+                  <pic:spPr>
+                    <a:xfrm>
+                      <a:off x="0" y="0"/>
+                      <a:ext cx="5303520" cy="5303520"/>
+                    </a:xfrm>
+                    <a:prstGeom prst="rect"/>
+                  </pic:spPr>
+                </pic:pic>
+              </a:graphicData>
+            </a:graphic>
+          </wp:inline>
+        </w:drawing>
+      </w:r>
+    </w:p>
+    <w:p>
+      <w:pPr>
+        <w:jc w:val="center"/>
+      </w:pPr>
+      <w:r>
+        <w:rPr>
+          <w:i/>
+          <w:sz w:val="18"/>
+        </w:rPr>
+        <w:t>Figure 9 — phpMyAdmin: ExamResults table with sample student records</w:t>
+      </w:r>
+    </w:p>
+    <w:p>
+      <w:pPr/>
+      <w:r>
+        <w:rPr>
+          <w:b/>
+          <w:sz w:val="22"/>
+        </w:rPr>
+        <w:t>Database Connection Settings (DatabaseManager.java):</w:t>
+      </w:r>
+    </w:p>
+    <w:p>
+      <w:pPr>
+        <w:ind w:left="567"/>
+      </w:pPr>
+      <w:r>
+        <w:rPr>
+          <w:rFonts w:ascii="Courier New" w:hAnsi="Courier New"/>
+          <w:color w:val="006000"/>
+          <w:sz w:val="18"/>
+        </w:rPr>
+        <w:t>URL:       jdbc:mysql://localhost:3306/onlineexam</w:t>
+        <w:br/>
+        <w:t>Username:  root</w:t>
+        <w:br/>
+        <w:t>Password:  (empty — default XAMPP)</w:t>
+        <w:br/>
+        <w:t>Tool:      XAMPP &gt; phpMyAdmin &gt; http://localhost/phpmyadmin</w:t>
+      </w:r>
+    </w:p>
+    <w:p>
+      <w:pPr/>
+    </w:p>
+    <w:p>
+      <w:pPr>
+        <w:pStyle w:val="Heading2"/>
+      </w:pPr>
+      <w:r>
+        <w:rPr>
+          <w:color w:val="2E74B5"/>
+        </w:rPr>
+        <w:t>6.4  Key Database Operations</w:t>
       </w:r>
     </w:p>
     <w:tbl>

</xml_diff>